<commit_message>
feat(agents): add grounded research & design skill (SK-13) and acrme-research-designer agent
</commit_message>
<xml_diff>
--- a/Agents.docx
+++ b/Agents.docx
@@ -2,7 +2,7 @@
 <file path=word/document.xml><?xml version="1.0" encoding="utf-8"?>
 <w:document xmlns:w="http://schemas.openxmlformats.org/wordprocessingml/2006/main" xmlns:m="http://schemas.openxmlformats.org/officeDocument/2006/math" xmlns:r="http://schemas.openxmlformats.org/officeDocument/2006/relationships" xmlns:o="urn:schemas-microsoft-com:office:office" xmlns:v="urn:schemas-microsoft-com:vml" xmlns:w10="urn:schemas-microsoft-com:office:word" xmlns:a="http://schemas.openxmlformats.org/drawingml/2006/main" xmlns:pic="http://schemas.openxmlformats.org/drawingml/2006/picture" xmlns:wp="http://schemas.openxmlformats.org/drawingml/2006/wordprocessingDrawing">
   <w:body>
-    <w:bookmarkStart w:id="61" w:name="acrme-programme-agent-roster"/>
+    <w:bookmarkStart w:id="62" w:name="acrme-programme-agent-roster"/>
     <w:p>
       <w:pPr>
         <w:pStyle w:val="Heading1"/>
@@ -278,7 +278,7 @@
       </w:r>
     </w:p>
     <w:bookmarkEnd w:id="21"/>
-    <w:bookmarkStart w:id="57" w:name="agent-roster"/>
+    <w:bookmarkStart w:id="58" w:name="agent-roster"/>
     <w:p>
       <w:pPr>
         <w:pStyle w:val="Heading2"/>
@@ -294,7 +294,7 @@
         </w:pict>
       </w:r>
     </w:p>
-    <w:bookmarkStart w:id="28" w:name="X68eaf3427b716c1031d76879c0654f9d63e32ce"/>
+    <w:bookmarkStart w:id="29" w:name="X68eaf3427b716c1031d76879c0654f9d63e32ce"/>
     <w:p>
       <w:pPr>
         <w:pStyle w:val="Heading3"/>
@@ -1039,7 +1039,119 @@
           </w:p>
         </w:tc>
       </w:tr>
+      <w:tr>
+        <w:tc>
+          <w:tcPr/>
+          <w:p>
+            <w:pPr>
+              <w:pStyle w:val="Compact"/>
+              <w:jc w:val="left"/>
+            </w:pPr>
+            <w:r>
+              <w:t xml:space="preserve">Research &amp; design agent profile</w:t>
+            </w:r>
+          </w:p>
+        </w:tc>
+        <w:tc>
+          <w:tcPr/>
+          <w:p>
+            <w:pPr>
+              <w:pStyle w:val="Compact"/>
+              <w:jc w:val="left"/>
+            </w:pPr>
+            <w:r>
+              <w:rPr>
+                <w:rStyle w:val="VerbatimChar"/>
+              </w:rPr>
+              <w:t xml:space="preserve">.github/agents/acrme-research-designer.agent.md</w:t>
+            </w:r>
+          </w:p>
+        </w:tc>
+      </w:tr>
+      <w:tr>
+        <w:tc>
+          <w:tcPr/>
+          <w:p>
+            <w:pPr>
+              <w:pStyle w:val="Compact"/>
+              <w:jc w:val="left"/>
+            </w:pPr>
+            <w:r>
+              <w:t xml:space="preserve">Grounding skill (SK-13)</w:t>
+            </w:r>
+          </w:p>
+        </w:tc>
+        <w:tc>
+          <w:tcPr/>
+          <w:p>
+            <w:pPr>
+              <w:pStyle w:val="Compact"/>
+              <w:jc w:val="left"/>
+            </w:pPr>
+            <w:r>
+              <w:rPr>
+                <w:rStyle w:val="VerbatimChar"/>
+              </w:rPr>
+              <w:t xml:space="preserve">.github/skills/grounding-acrme-research-design/</w:t>
+            </w:r>
+          </w:p>
+        </w:tc>
+      </w:tr>
     </w:tbl>
+    <w:bookmarkEnd w:id="27"/>
+    <w:bookmarkStart w:id="28" w:name="research-design-mode"/>
+    <w:p>
+      <w:pPr>
+        <w:pStyle w:val="Heading4"/>
+      </w:pPr>
+      <w:r>
+        <w:t xml:space="preserve">Research &amp; Design Mode</w:t>
+      </w:r>
+    </w:p>
+    <w:p>
+      <w:pPr>
+        <w:pStyle w:val="FirstParagraph"/>
+      </w:pPr>
+      <w:r>
+        <w:t xml:space="preserve">For research, design, formula, and review work this agent runs as</w:t>
+      </w:r>
+      <w:r>
+        <w:t xml:space="preserve"> </w:t>
+      </w:r>
+      <w:r>
+        <w:rPr>
+          <w:rStyle w:val="VerbatimChar"/>
+        </w:rPr>
+        <w:t xml:space="preserve">.github/agents/acrme-research-designer.agent.md</w:t>
+      </w:r>
+      <w:r>
+        <w:t xml:space="preserve">, which executes skill SK-13 (</w:t>
+      </w:r>
+      <w:r>
+        <w:rPr>
+          <w:rStyle w:val="VerbatimChar"/>
+        </w:rPr>
+        <w:t xml:space="preserve">grounding-acrme-research-design</w:t>
+      </w:r>
+      <w:r>
+        <w:t xml:space="preserve">): resolve the current baseline version, map sources, tag evidence, gate against baseline/HC/WAF, and lint the output with</w:t>
+      </w:r>
+      <w:r>
+        <w:t xml:space="preserve"> </w:t>
+      </w:r>
+      <w:r>
+        <w:rPr>
+          <w:rStyle w:val="VerbatimChar"/>
+        </w:rPr>
+        <w:t xml:space="preserve">check_grounding.py</w:t>
+      </w:r>
+      <w:r>
+        <w:t xml:space="preserve"> </w:t>
+      </w:r>
+      <w:r>
+        <w:t xml:space="preserve">before delivery.</w:t>
+      </w:r>
+    </w:p>
     <w:p>
       <w:r>
         <w:pict>
@@ -1047,9 +1159,9 @@
         </w:pict>
       </w:r>
     </w:p>
-    <w:bookmarkEnd w:id="27"/>
     <w:bookmarkEnd w:id="28"/>
-    <w:bookmarkStart w:id="36" w:name="agent-2-acrme-implementation-engineer"/>
+    <w:bookmarkEnd w:id="29"/>
+    <w:bookmarkStart w:id="37" w:name="agent-2-acrme-implementation-engineer"/>
     <w:p>
       <w:pPr>
         <w:pStyle w:val="Heading3"/>
@@ -1092,7 +1204,7 @@
         <w:t xml:space="preserve">Python + Azure SDK specialist</w:t>
       </w:r>
     </w:p>
-    <w:bookmarkStart w:id="29" w:name="role-1"/>
+    <w:bookmarkStart w:id="30" w:name="role-1"/>
     <w:p>
       <w:pPr>
         <w:pStyle w:val="Heading4"/>
@@ -1124,8 +1236,8 @@
         <w:t xml:space="preserve">codebase and does not modify design documents or the requirements baseline.</w:t>
       </w:r>
     </w:p>
-    <w:bookmarkEnd w:id="29"/>
-    <w:bookmarkStart w:id="30" w:name="primary-domain-1"/>
+    <w:bookmarkEnd w:id="30"/>
+    <w:bookmarkStart w:id="31" w:name="primary-domain-1"/>
     <w:p>
       <w:pPr>
         <w:pStyle w:val="Heading4"/>
@@ -1251,8 +1363,8 @@
         <w:t xml:space="preserve">CI/CD pipeline configuration (GitHub Actions)</w:t>
       </w:r>
     </w:p>
-    <w:bookmarkEnd w:id="30"/>
-    <w:bookmarkStart w:id="31" w:name="component-responsibility-map"/>
+    <w:bookmarkEnd w:id="31"/>
+    <w:bookmarkStart w:id="32" w:name="component-responsibility-map"/>
     <w:p>
       <w:pPr>
         <w:pStyle w:val="Heading4"/>
@@ -1724,8 +1836,8 @@
         </w:tc>
       </w:tr>
     </w:tbl>
-    <w:bookmarkEnd w:id="31"/>
-    <w:bookmarkStart w:id="32" w:name="capabilities-1"/>
+    <w:bookmarkEnd w:id="32"/>
+    <w:bookmarkStart w:id="33" w:name="capabilities-1"/>
     <w:p>
       <w:pPr>
         <w:pStyle w:val="Heading4"/>
@@ -1869,8 +1981,8 @@
         <w:t xml:space="preserve">Writes tests alongside code — no implementation without test coverage</w:t>
       </w:r>
     </w:p>
-    <w:bookmarkEnd w:id="32"/>
-    <w:bookmarkStart w:id="33" w:name="interaction-model-1"/>
+    <w:bookmarkEnd w:id="33"/>
+    <w:bookmarkStart w:id="34" w:name="interaction-model-1"/>
     <w:p>
       <w:pPr>
         <w:pStyle w:val="Heading4"/>
@@ -1962,8 +2074,8 @@
         <w:t xml:space="preserve">        └── Escalates to Architect ──────────► Ambiguous requirement / HC conflict</w:t>
       </w:r>
     </w:p>
-    <w:bookmarkEnd w:id="33"/>
-    <w:bookmarkStart w:id="34" w:name="constraints"/>
+    <w:bookmarkEnd w:id="34"/>
+    <w:bookmarkStart w:id="35" w:name="constraints"/>
     <w:p>
       <w:pPr>
         <w:pStyle w:val="Heading4"/>
@@ -2044,8 +2156,8 @@
         <w:t xml:space="preserve">Decommission workflow (CAP-010) is a separate code path — never triggered from reconciliation</w:t>
       </w:r>
     </w:p>
-    <w:bookmarkEnd w:id="34"/>
-    <w:bookmarkStart w:id="35" w:name="owned-artefacts-1"/>
+    <w:bookmarkEnd w:id="35"/>
+    <w:bookmarkStart w:id="36" w:name="owned-artefacts-1"/>
     <w:p>
       <w:pPr>
         <w:pStyle w:val="Heading4"/>
@@ -2246,9 +2358,9 @@
         </w:pict>
       </w:r>
     </w:p>
-    <w:bookmarkEnd w:id="35"/>
     <w:bookmarkEnd w:id="36"/>
-    <w:bookmarkStart w:id="44" w:name="agent-3-acrme-poc-validation-engineer"/>
+    <w:bookmarkEnd w:id="37"/>
+    <w:bookmarkStart w:id="45" w:name="agent-3-acrme-poc-validation-engineer"/>
     <w:p>
       <w:pPr>
         <w:pStyle w:val="Heading3"/>
@@ -2291,7 +2403,7 @@
         <w:t xml:space="preserve">Azure CLI + Python scripting, live Azure environment access</w:t>
       </w:r>
     </w:p>
-    <w:bookmarkStart w:id="37" w:name="role-2"/>
+    <w:bookmarkStart w:id="38" w:name="role-2"/>
     <w:p>
       <w:pPr>
         <w:pStyle w:val="Heading4"/>
@@ -2308,8 +2420,8 @@
         <w:t xml:space="preserve">Executes the ACRME POC workbook (v2.4, 49 cases, G1–G12) in a controlled Azure test environment. Documents findings with evidence, determines PASS/FAIL/BLOCKED status for each case, and feeds results back to the Architect agent for design decision updates. Does not modify production Azure resources.</w:t>
       </w:r>
     </w:p>
-    <w:bookmarkEnd w:id="37"/>
-    <w:bookmarkStart w:id="38" w:name="primary-domain-2"/>
+    <w:bookmarkEnd w:id="38"/>
+    <w:bookmarkStart w:id="39" w:name="primary-domain-2"/>
     <w:p>
       <w:pPr>
         <w:pStyle w:val="Heading4"/>
@@ -2426,8 +2538,8 @@
         <w:t xml:space="preserve">Reservation eligibility matrix (G9)</w:t>
       </w:r>
     </w:p>
-    <w:bookmarkEnd w:id="38"/>
-    <w:bookmarkStart w:id="39" w:name="poc-priority-order"/>
+    <w:bookmarkEnd w:id="39"/>
+    <w:bookmarkStart w:id="40" w:name="poc-priority-order"/>
     <w:p>
       <w:pPr>
         <w:pStyle w:val="Heading4"/>
@@ -2826,8 +2938,8 @@
         </w:tc>
       </w:tr>
     </w:tbl>
-    <w:bookmarkEnd w:id="39"/>
-    <w:bookmarkStart w:id="40" w:name="capabilities-2"/>
+    <w:bookmarkEnd w:id="40"/>
+    <w:bookmarkStart w:id="41" w:name="capabilities-2"/>
     <w:p>
       <w:pPr>
         <w:pStyle w:val="Heading4"/>
@@ -2920,8 +3032,8 @@
         <w:t xml:space="preserve">G9–G12 offline cases executable without live Azure environment</w:t>
       </w:r>
     </w:p>
-    <w:bookmarkEnd w:id="40"/>
-    <w:bookmarkStart w:id="41" w:name="interaction-model-2"/>
+    <w:bookmarkEnd w:id="41"/>
+    <w:bookmarkStart w:id="42" w:name="interaction-model-2"/>
     <w:p>
       <w:pPr>
         <w:pStyle w:val="Heading4"/>
@@ -3022,8 +3134,8 @@
         <w:t xml:space="preserve">                                               Design invalidations / new unknowns</w:t>
       </w:r>
     </w:p>
-    <w:bookmarkEnd w:id="41"/>
-    <w:bookmarkStart w:id="42" w:name="constraints-1"/>
+    <w:bookmarkEnd w:id="42"/>
+    <w:bookmarkStart w:id="43" w:name="constraints-1"/>
     <w:p>
       <w:pPr>
         <w:pStyle w:val="Heading4"/>
@@ -3092,8 +3204,8 @@
         <w:t xml:space="preserve">A passing POC does not override a hard constraint — HC violations found in POC results are escalated, not resolved by the POC engineer</w:t>
       </w:r>
     </w:p>
-    <w:bookmarkEnd w:id="42"/>
-    <w:bookmarkStart w:id="43" w:name="owned-artefacts-2"/>
+    <w:bookmarkEnd w:id="43"/>
+    <w:bookmarkStart w:id="44" w:name="owned-artefacts-2"/>
     <w:p>
       <w:pPr>
         <w:pStyle w:val="Heading4"/>
@@ -3265,9 +3377,9 @@
         </w:pict>
       </w:r>
     </w:p>
-    <w:bookmarkEnd w:id="43"/>
     <w:bookmarkEnd w:id="44"/>
-    <w:bookmarkStart w:id="51" w:name="agent-4-acrme-documentation-steward"/>
+    <w:bookmarkEnd w:id="45"/>
+    <w:bookmarkStart w:id="52" w:name="agent-4-acrme-documentation-steward"/>
     <w:p>
       <w:pPr>
         <w:pStyle w:val="Heading3"/>
@@ -3310,7 +3422,7 @@
         <w:t xml:space="preserve">Technical writing + Azure domain knowledge</w:t>
       </w:r>
     </w:p>
-    <w:bookmarkStart w:id="45" w:name="role-3"/>
+    <w:bookmarkStart w:id="46" w:name="role-3"/>
     <w:p>
       <w:pPr>
         <w:pStyle w:val="Heading4"/>
@@ -3327,8 +3439,8 @@
         <w:t xml:space="preserve">Maintains the consistency, completeness, and normative accuracy of all ACRME programme documentation. Ensures that ADRs, design documents, and reference material are fully reconciled to the living requirements baseline. This agent does not originate architecture decisions — it ensures the documentation accurately reflects them.</w:t>
       </w:r>
     </w:p>
-    <w:bookmarkEnd w:id="45"/>
-    <w:bookmarkStart w:id="46" w:name="primary-domain-3"/>
+    <w:bookmarkEnd w:id="46"/>
+    <w:bookmarkStart w:id="47" w:name="primary-domain-3"/>
     <w:p>
       <w:pPr>
         <w:pStyle w:val="Heading4"/>
@@ -3409,8 +3521,8 @@
         <w:t xml:space="preserve">Changelog and version tagging</w:t>
       </w:r>
     </w:p>
-    <w:bookmarkEnd w:id="46"/>
-    <w:bookmarkStart w:id="47" w:name="capabilities-3"/>
+    <w:bookmarkEnd w:id="47"/>
+    <w:bookmarkStart w:id="48" w:name="capabilities-3"/>
     <w:p>
       <w:pPr>
         <w:pStyle w:val="Heading4"/>
@@ -3479,8 +3591,8 @@
         <w:t xml:space="preserve">Reviews backlog stories for acceptance-criteria completeness</w:t>
       </w:r>
     </w:p>
-    <w:bookmarkEnd w:id="47"/>
-    <w:bookmarkStart w:id="48" w:name="the-completeness-rule-mandatory"/>
+    <w:bookmarkEnd w:id="48"/>
+    <w:bookmarkStart w:id="49" w:name="the-completeness-rule-mandatory"/>
     <w:p>
       <w:pPr>
         <w:pStyle w:val="Heading4"/>
@@ -3527,8 +3639,8 @@
         <w:t xml:space="preserve">Specifically: ADRs covering reliability or DR must include the five-state engine state machine, VR-1..VR-11 validation framework, exact scoring formulas, and the 10-step capacity lifecycle where applicable (per §26–§32 of the baseline).</w:t>
       </w:r>
     </w:p>
-    <w:bookmarkEnd w:id="48"/>
-    <w:bookmarkStart w:id="49" w:name="interaction-model-3"/>
+    <w:bookmarkEnd w:id="49"/>
+    <w:bookmarkStart w:id="50" w:name="interaction-model-3"/>
     <w:p>
       <w:pPr>
         <w:pStyle w:val="Heading4"/>
@@ -3620,8 +3732,8 @@
         <w:t xml:space="preserve">        └── Publishes ───────────────────────► Updated reference material, changelog entries</w:t>
       </w:r>
     </w:p>
-    <w:bookmarkEnd w:id="49"/>
-    <w:bookmarkStart w:id="50" w:name="owned-artefacts-3"/>
+    <w:bookmarkEnd w:id="50"/>
+    <w:bookmarkStart w:id="51" w:name="owned-artefacts-3"/>
     <w:p>
       <w:pPr>
         <w:pStyle w:val="Heading4"/>
@@ -3851,9 +3963,9 @@
         </w:pict>
       </w:r>
     </w:p>
-    <w:bookmarkEnd w:id="50"/>
     <w:bookmarkEnd w:id="51"/>
-    <w:bookmarkStart w:id="56" w:name="agent-5-acrme-finops-analyst"/>
+    <w:bookmarkEnd w:id="52"/>
+    <w:bookmarkStart w:id="57" w:name="agent-5-acrme-finops-analyst"/>
     <w:p>
       <w:pPr>
         <w:pStyle w:val="Heading3"/>
@@ -3896,7 +4008,7 @@
         <w:t xml:space="preserve">Cost optimisation + Azure pricing + FinOps</w:t>
       </w:r>
     </w:p>
-    <w:bookmarkStart w:id="52" w:name="role-4"/>
+    <w:bookmarkStart w:id="53" w:name="role-4"/>
     <w:p>
       <w:pPr>
         <w:pStyle w:val="Heading4"/>
@@ -3913,8 +4025,8 @@
         <w:t xml:space="preserve">Performs cost modelling for ACRME capacity decisions. Quantifies the trade-offs between reservation buffer size, DR overcommit ratios, CVAL sacrifice, and idle reservation cost. Provides the business case inputs for capacity decisions.</w:t>
       </w:r>
     </w:p>
-    <w:bookmarkEnd w:id="52"/>
-    <w:bookmarkStart w:id="53" w:name="primary-domain-4"/>
+    <w:bookmarkEnd w:id="53"/>
+    <w:bookmarkStart w:id="54" w:name="primary-domain-4"/>
     <w:p>
       <w:pPr>
         <w:pStyle w:val="Heading4"/>
@@ -3995,8 +4107,8 @@
         <w:t xml:space="preserve">Cost alerting thresholds and anomaly detection</w:t>
       </w:r>
     </w:p>
-    <w:bookmarkEnd w:id="53"/>
-    <w:bookmarkStart w:id="54" w:name="key-cost-principles-from-2"/>
+    <w:bookmarkEnd w:id="54"/>
+    <w:bookmarkStart w:id="55" w:name="key-cost-principles-from-2"/>
     <w:p>
       <w:pPr>
         <w:pStyle w:val="Heading4"/>
@@ -4065,8 +4177,8 @@
         <w:t xml:space="preserve">Idle reservation spend is a first-class metric</w:t>
       </w:r>
     </w:p>
-    <w:bookmarkEnd w:id="54"/>
-    <w:bookmarkStart w:id="55" w:name="interaction-model-4"/>
+    <w:bookmarkEnd w:id="55"/>
+    <w:bookmarkStart w:id="56" w:name="interaction-model-4"/>
     <w:p>
       <w:pPr>
         <w:pStyle w:val="Heading4"/>
@@ -4147,10 +4259,10 @@
         </w:pict>
       </w:r>
     </w:p>
-    <w:bookmarkEnd w:id="55"/>
     <w:bookmarkEnd w:id="56"/>
     <w:bookmarkEnd w:id="57"/>
-    <w:bookmarkStart w:id="58" w:name="agent-interaction-summary"/>
+    <w:bookmarkEnd w:id="58"/>
+    <w:bookmarkStart w:id="59" w:name="agent-interaction-summary"/>
     <w:p>
       <w:pPr>
         <w:pStyle w:val="Heading2"/>
@@ -4402,8 +4514,8 @@
         </w:pict>
       </w:r>
     </w:p>
-    <w:bookmarkEnd w:id="58"/>
-    <w:bookmarkStart w:id="59" w:name="agent-boundary-rules"/>
+    <w:bookmarkEnd w:id="59"/>
+    <w:bookmarkStart w:id="60" w:name="agent-boundary-rules"/>
     <w:p>
       <w:pPr>
         <w:pStyle w:val="Heading2"/>
@@ -4669,8 +4781,8 @@
         </w:pict>
       </w:r>
     </w:p>
-    <w:bookmarkEnd w:id="59"/>
-    <w:bookmarkStart w:id="60" w:name="programme-state-as-of-v1.0"/>
+    <w:bookmarkEnd w:id="60"/>
+    <w:bookmarkStart w:id="61" w:name="programme-state-as-of-v1.0"/>
     <w:p>
       <w:pPr>
         <w:pStyle w:val="Heading2"/>
@@ -4922,8 +5034,8 @@
         </w:tc>
       </w:tr>
     </w:tbl>
-    <w:bookmarkEnd w:id="60"/>
     <w:bookmarkEnd w:id="61"/>
+    <w:bookmarkEnd w:id="62"/>
     <w:sectPr/>
   </w:body>
 </w:document>

</xml_diff>